<commit_message>
Clarify regional variable definitions and fix report table
</commit_message>
<xml_diff>
--- a/outputs/Card_Krueger_Empirical_Report.docx
+++ b/outputs/Card_Krueger_Empirical_Report.docx
@@ -2117,18 +2117,8 @@
             </w:tcBorders>
           </w:tcPr>
           <w:p>
-            <w:pPr>
-              <w:spacing w:after="0"/>
-              <w:jc w:val="center"/>
-            </w:pPr>
-            <w:r/>
-            <w:r>
-              <w:rPr>
-                <w:rFonts w:ascii="Aptos" w:hAnsi="Aptos"/>
-                <w:b w:val="0"/>
-                <w:color w:val="1F2933"/>
-                <w:sz w:val="14"/>
-              </w:rPr>
+            <w:r>
+              <w:t>-0.59</w:t>
             </w:r>
           </w:p>
         </w:tc>
@@ -2241,18 +2231,8 @@
             <w:shd w:fill="F3F7FA"/>
           </w:tcPr>
           <w:p>
-            <w:pPr>
-              <w:spacing w:after="0"/>
-              <w:jc w:val="center"/>
-            </w:pPr>
-            <w:r/>
-            <w:r>
-              <w:rPr>
-                <w:rFonts w:ascii="Aptos" w:hAnsi="Aptos"/>
-                <w:b w:val="0"/>
-                <w:color w:val="1F2933"/>
-                <w:sz w:val="14"/>
-              </w:rPr>
+            <w:r>
+              <w:t>-0.17</w:t>
             </w:r>
           </w:p>
         </w:tc>
@@ -2363,18 +2343,8 @@
             </w:tcBorders>
           </w:tcPr>
           <w:p>
-            <w:pPr>
-              <w:spacing w:after="0"/>
-              <w:jc w:val="center"/>
-            </w:pPr>
-            <w:r/>
-            <w:r>
-              <w:rPr>
-                <w:rFonts w:ascii="Aptos" w:hAnsi="Aptos"/>
-                <w:b w:val="0"/>
-                <w:color w:val="1F2933"/>
-                <w:sz w:val="14"/>
-              </w:rPr>
+            <w:r>
+              <w:t>0.38</w:t>
             </w:r>
           </w:p>
         </w:tc>
@@ -2487,18 +2457,8 @@
             <w:shd w:fill="F3F7FA"/>
           </w:tcPr>
           <w:p>
-            <w:pPr>
-              <w:spacing w:after="0"/>
-              <w:jc w:val="center"/>
-            </w:pPr>
-            <w:r/>
-            <w:r>
-              <w:rPr>
-                <w:rFonts w:ascii="Aptos" w:hAnsi="Aptos"/>
-                <w:b w:val="0"/>
-                <w:color w:val="1F2933"/>
-                <w:sz w:val="14"/>
-              </w:rPr>
+            <w:r>
+              <w:t>-2.24</w:t>
             </w:r>
           </w:p>
         </w:tc>
@@ -2609,18 +2569,8 @@
             </w:tcBorders>
           </w:tcPr>
           <w:p>
-            <w:pPr>
-              <w:spacing w:after="0"/>
-              <w:jc w:val="center"/>
-            </w:pPr>
-            <w:r/>
-            <w:r>
-              <w:rPr>
-                <w:rFonts w:ascii="Aptos" w:hAnsi="Aptos"/>
-                <w:b w:val="0"/>
-                <w:color w:val="1F2933"/>
-                <w:sz w:val="14"/>
-              </w:rPr>
+            <w:r>
+              <w:t>1.35</w:t>
             </w:r>
           </w:p>
         </w:tc>
@@ -2733,18 +2683,8 @@
             <w:shd w:fill="F3F7FA"/>
           </w:tcPr>
           <w:p>
-            <w:pPr>
-              <w:spacing w:after="0"/>
-              <w:jc w:val="center"/>
-            </w:pPr>
-            <w:r/>
-            <w:r>
-              <w:rPr>
-                <w:rFonts w:ascii="Aptos" w:hAnsi="Aptos"/>
-                <w:b w:val="0"/>
-                <w:color w:val="1F2933"/>
-                <w:sz w:val="14"/>
-              </w:rPr>
+            <w:r>
+              <w:t>-0.23</w:t>
             </w:r>
           </w:p>
         </w:tc>
@@ -2855,18 +2795,8 @@
             </w:tcBorders>
           </w:tcPr>
           <w:p>
-            <w:pPr>
-              <w:spacing w:after="0"/>
-              <w:jc w:val="center"/>
-            </w:pPr>
-            <w:r/>
-            <w:r>
-              <w:rPr>
-                <w:rFonts w:ascii="Aptos" w:hAnsi="Aptos"/>
-                <w:b w:val="0"/>
-                <w:color w:val="1F2933"/>
-                <w:sz w:val="14"/>
-              </w:rPr>
+            <w:r>
+              <w:t>-1.56</w:t>
             </w:r>
           </w:p>
         </w:tc>
@@ -2979,18 +2909,8 @@
             <w:shd w:fill="F3F7FA"/>
           </w:tcPr>
           <w:p>
-            <w:pPr>
-              <w:spacing w:after="0"/>
-              <w:jc w:val="center"/>
-            </w:pPr>
-            <w:r/>
-            <w:r>
-              <w:rPr>
-                <w:rFonts w:ascii="Aptos" w:hAnsi="Aptos"/>
-                <w:b w:val="0"/>
-                <w:color w:val="1F2933"/>
-                <w:sz w:val="14"/>
-              </w:rPr>
+            <w:r>
+              <w:t>-0.16</w:t>
             </w:r>
           </w:p>
         </w:tc>
@@ -3101,18 +3021,8 @@
             </w:tcBorders>
           </w:tcPr>
           <w:p>
-            <w:pPr>
-              <w:spacing w:after="0"/>
-              <w:jc w:val="center"/>
-            </w:pPr>
-            <w:r/>
-            <w:r>
-              <w:rPr>
-                <w:rFonts w:ascii="Aptos" w:hAnsi="Aptos"/>
-                <w:b w:val="0"/>
-                <w:color w:val="1F2933"/>
-                <w:sz w:val="14"/>
-              </w:rPr>
+            <w:r>
+              <w:t>-3.51</w:t>
             </w:r>
           </w:p>
         </w:tc>
@@ -3225,18 +3135,8 @@
             <w:shd w:fill="F3F7FA"/>
           </w:tcPr>
           <w:p>
-            <w:pPr>
-              <w:spacing w:after="0"/>
-              <w:jc w:val="center"/>
-            </w:pPr>
-            <w:r/>
-            <w:r>
-              <w:rPr>
-                <w:rFonts w:ascii="Aptos" w:hAnsi="Aptos"/>
-                <w:b w:val="0"/>
-                <w:color w:val="1F2933"/>
-                <w:sz w:val="14"/>
-              </w:rPr>
+            <w:r>
+              <w:t>17.08</w:t>
             </w:r>
           </w:p>
         </w:tc>
@@ -3347,18 +3247,8 @@
             </w:tcBorders>
           </w:tcPr>
           <w:p>
-            <w:pPr>
-              <w:spacing w:after="0"/>
-              <w:jc w:val="center"/>
-            </w:pPr>
-            <w:r/>
-            <w:r>
-              <w:rPr>
-                <w:rFonts w:ascii="Aptos" w:hAnsi="Aptos"/>
-                <w:b w:val="0"/>
-                <w:color w:val="1F2933"/>
-                <w:sz w:val="14"/>
-              </w:rPr>
+            <w:r>
+              <w:t>-14.46</w:t>
             </w:r>
           </w:p>
         </w:tc>
@@ -5962,7 +5852,7 @@
         <w:spacing w:after="40"/>
       </w:pPr>
       <w:r>
-        <w:t>The definitions of some regional indicators in the supplied data dictionary require final confirmation against the original source codebook.</w:t>
+        <w:t>The supplied data dictionary defines PA1 and PA2; the definitions of NORTHJ and SHORE require final confirmation against the original source codebook.</w:t>
       </w:r>
     </w:p>
     <w:p>

</xml_diff>

<commit_message>
Document regional controls from original paper
</commit_message>
<xml_diff>
--- a/outputs/Card_Krueger_Empirical_Report.docx
+++ b/outputs/Card_Krueger_Empirical_Report.docx
@@ -92,7 +92,7 @@
         <w:spacing w:after="120" w:line="269" w:lineRule="auto"/>
       </w:pPr>
       <w:r>
-        <w:t>The supplied public file contains 410 restaurants: 331 in New Jersey and 79 in Pennsylvania. Restaurants were surveyed before the policy change in February-March 1992 and again in November-December 1992. The assigned replication covers Tables 2-4 and Figure 1; restricted data for Table 1 are outside the replication scope.</w:t>
+        <w:t>The supplied public file contains 410 restaurants: 331 in New Jersey and 79 in Pennsylvania. Restaurants were surveyed before the policy change in February-March 1992 and again in November-December 1992. The assigned replication covers Tables 2-4 and Figure 1; restricted data for Table 1 are outside the replication scope. The course data dictionary defines PA1 as the northeastern Philadelphia suburbs and PA2 as the Easton area. Following the original paper, NORTHJ, CENTRALJ, and SOUTHJ represent the three New Jersey regions, while SHORE identifies New Jersey shore-area stores and is used only in the geographic-exclusion robustness check.</w:t>
       </w:r>
     </w:p>
     <w:p>
@@ -5852,7 +5852,7 @@
         <w:spacing w:after="40"/>
       </w:pPr>
       <w:r>
-        <w:t>The supplied data dictionary defines PA1 and PA2; the definitions of NORTHJ and SHORE require final confirmation against the original source codebook.</w:t>
+        <w:t>The course data dictionary defines PA1 and PA2, while the original paper documents the North/Central/South New Jersey region controls and the New Jersey shore-area exclusion. Any available town-level mapping used to construct the public indicators should be documented for full computational reproducibility.</w:t>
       </w:r>
     </w:p>
     <w:p>

</xml_diff>